<commit_message>
docs: delete PS0407 contradictory PDF, make x402 facilitator documentation honest about actual Indexer-based verification
</commit_message>
<xml_diff>
--- a/docs/PITCH_DECK.docx
+++ b/docs/PITCH_DECK.docx
@@ -929,7 +929,7 @@
         <w:br/>
         <w:t xml:space="preserve">                         │ ⚡ Hono Orchestrator (EC2) │</w:t>
         <w:br/>
-        <w:t xml:space="preserve">                         │   x402 Payment Middleware │</w:t>
+        <w:t xml:space="preserve">                         │   HTTP 402 Payment Gate   │</w:t>
         <w:br/>
         <w:t xml:space="preserve">                         │   Rate Limiter (10/min)   │</w:t>
         <w:br/>
@@ -1740,7 +1740,7 @@
         <w:rPr>
           <w:b/>
         </w:rPr>
-        <w:t>Q: Why use Box Storage instead of transaction notes?</w:t>
+        <w:t>Q: How is payment verified on-chain?</w:t>
       </w:r>
       <w:r/>
     </w:p>
@@ -1754,7 +1754,7 @@
           <w:i/>
           <w:color w:val="475569"/>
         </w:rPr>
-        <w:t>*Box storage allows contract-state verification. Third-party smart contracts on Algorand can directly inspect signal attestations via `box_get` without needing off-chain indexers.*</w:t>
+        <w:t>*The orchestrator calls the Algorand Indexer (`lookupTransactionByID`) to verify each payment is confirmed on-chain, sent to the correct recipient, for the correct amount and asset, with replay-attack prevention. A SHA-256 attestation digest (`sha256(token:score:verdict:txId:timestamp)`) is generated per signal and returned in the receipt for independent auditability.*</w:t>
       </w:r>
     </w:p>
     <w:p>

</xml_diff>

<commit_message>
feat(x402): implement full 402 challenge-retry flow, GoPlausible facilitator verification, and align docs with PS0404
</commit_message>
<xml_diff>
--- a/docs/PITCH_DECK.docx
+++ b/docs/PITCH_DECK.docx
@@ -303,10 +303,21 @@
         <w:rPr>
           <w:b/>
         </w:rPr>
-        <w:t>On-Chain Smart Contract:</w:t>
+        <w:t>Cryptographic Attestation:</w:t>
       </w:r>
       <w:r>
-        <w:t xml:space="preserve"> PyTeal ARC-4 Signal Attestation Contract (</w:t>
+        <w:t xml:space="preserve"> SHA-256 signal attestation digest (</w:t>
+      </w:r>
+      <w:r>
+        <w:rPr>
+          <w:rFonts w:ascii="Consolas" w:hAnsi="Consolas"/>
+          <w:color w:val="0284C7"/>
+          <w:sz w:val="19"/>
+        </w:rPr>
+        <w:t>sha256(token:score:verdict:txId:timestamp)</w:t>
+      </w:r>
+      <w:r>
+        <w:t>) returned per execution for independent verifiability. PyTeal Box Storage contract (</w:t>
       </w:r>
       <w:r>
         <w:rPr>
@@ -317,18 +328,7 @@
         <w:t>contracts/signal_attestation.py</w:t>
       </w:r>
       <w:r>
-        <w:t>) issuing SHA-256 Box Storage Hashes (</w:t>
-      </w:r>
-      <w:r>
-        <w:rPr>
-          <w:rFonts w:ascii="Consolas" w:hAnsi="Consolas"/>
-          <w:color w:val="0284C7"/>
-          <w:sz w:val="19"/>
-        </w:rPr>
-        <w:t>sha256(token:score:verdict:txId:timestamp)</w:t>
-      </w:r>
-      <w:r>
-        <w:t>).</w:t>
+        <w:t>) prepared for mainnet deployment.</w:t>
       </w:r>
     </w:p>
     <w:p>
@@ -482,7 +482,7 @@
               <w:rPr>
                 <w:sz w:val="20"/>
               </w:rPr>
-              <w:t>**Immutable Box Storage Attestation:** Every fused signal produces an ARC-4 Box Storage hash on Algorand Testnet.</w:t>
+              <w:t>**Cryptographic Attestation:** Every fused signal produces a SHA-256 attestation digest tied to the payment transaction, returned in the on-chain receipt for independent verification.</w:t>
             </w:r>
           </w:p>
         </w:tc>
@@ -985,23 +985,21 @@
         <w:br/>
         <w:t xml:space="preserve">                         ┌───────────┐   ┌───────────────────────────┐</w:t>
         <w:br/>
-        <w:t xml:space="preserve">                         │ HTTP 502  │   │ HTTP 402 Challenge        │</w:t>
+        <w:t xml:space="preserve">                         │ HTTP 502  │   │ Lute Wallet Signs $0.007  │</w:t>
         <w:br/>
-        <w:t xml:space="preserve">                         │ Zero Fee  │   │ Lute Wallet Signs $0.007  │</w:t>
+        <w:t xml:space="preserve">                         │ Zero Fee  │   └─────────────┬─────────────┘</w:t>
         <w:br/>
-        <w:t xml:space="preserve">                         └───────────┘   └─────────────┬─────────────┘</w:t>
-        <w:br/>
-        <w:t xml:space="preserve">                                                       │</w:t>
+        <w:t xml:space="preserve">                         └───────────┘                 │</w:t>
         <w:br/>
         <w:t xml:space="preserve">                                                       ▼</w:t>
         <w:br/>
-        <w:t xml:space="preserve">                                         ┌───────────────────────────┐</w:t>
+        <w:t xml:space="preserve">                                          ┌───────────────────────────┐</w:t>
         <w:br/>
-        <w:t xml:space="preserve">                                         │ ⛓️ Algorand Box Storage   │</w:t>
+        <w:t xml:space="preserve">                                          │ 🔐 SHA-256 Attestation    │</w:t>
         <w:br/>
-        <w:t xml:space="preserve">                                         │ SHA-256 Attestation Hash  │</w:t>
+        <w:t xml:space="preserve">                                          │ Cryptographic Digest      │</w:t>
         <w:br/>
-        <w:t xml:space="preserve">                                         └───────────────────────────┘</w:t>
+        <w:t xml:space="preserve">                                          └───────────────────────────┘</w:t>
       </w:r>
     </w:p>
     <w:p>

</xml_diff>